<commit_message>
Legal templates: one Policies & procedures page, four new procedures
- New templates: Disciplinary and Grievance Procedure, Safer Recruitment Procedure,
  Finance Procedures, Policy Approval and Review Procedure (library now 51)
- Policies and Procedures merged into one page; each card labelled Policy,
  Policy with procedure steps, Policy and procedure, Procedure or Notice, with a legend
- legal-templates-procedures.html redirects to the merged page; course links updated
- Prices page counts updated to 51; the four new procedures sit in the Procedures & consent pack
- Existing templates now cross-reference the new procedures; two defaults aligned

Co-Authored-By: Claude Opus 5.5 <noreply@anthropic.com>
Claude-Session: https://claude.ai/code/session_012WEC1ptH9Sb6YaXrq9Eqa8
</commit_message>
<xml_diff>
--- a/assets/legal-templates/anti-harassment-intimidation-and-bullying-policy-and-procedure.docx
+++ b/assets/legal-templates/anti-harassment-intimidation-and-bullying-policy-and-procedure.docx
@@ -911,7 +911,7 @@
                 <w:sz w:val="17"/>
                 <w:szCs w:val="17"/>
               </w:rPr>
-              <w:t xml:space="preserve">Code of Conduct · Safeguarding Policy and Procedure · Whistleblowing Policy and Procedure · Independent Contact Role Note · Equality, Diversity and Inclusion Policy · Social Media and Communications Policy · Data Protection Policy · Employment Contract · Volunteer Agreement</w:t>
+              <w:t xml:space="preserve">Code of Conduct · Safeguarding Policy and Procedure · Whistleblowing Policy and Procedure · Independent Contact Role Note · Equality, Diversity and Inclusion Policy · Social Media and Communications Policy · Data Protection Policy · Employment Contract · Volunteer Agreement · Disciplinary and Grievance Procedure</w:t>
             </w:r>
           </w:p>
         </w:tc>
@@ -6306,7 +6306,7 @@
                 <w:sz w:val="15"/>
                 <w:szCs w:val="15"/>
               </w:rPr>
-              <w:t xml:space="preserve">ADAPT THIS · INVESTIGATIONS AND YOUR DISCIPLINARY PROCEDURE</w:t>
+              <w:t xml:space="preserve">ADAPT THIS · INVESTIGATIONS AND YOUR DISCIPLINARY AND GRIEVANCE PROCEDURE</w:t>
             </w:r>
           </w:p>
           <w:p>
@@ -6320,7 +6320,7 @@
                 <w:sz w:val="19"/>
                 <w:szCs w:val="19"/>
               </w:rPr>
-              <w:t xml:space="preserve">Check your employment law. In many countries, an employer must follow a set process before a warning or dismissal: written notice of the allegation, a hearing, the right to be accompanied, and a written decision. In the United Kingdom, for example, workers have a legal right to be accompanied at disciplinary and grievance hearings. Make sure this section matches your employment contracts and disciplinary procedure. Budget for an external investigator: ask a local employment lawyer, HR consultancy or a peer organisation for names before you need one.</w:t>
+              <w:t xml:space="preserve">Check your employment law. In many countries, an employer must follow a set process before a warning or dismissal: written notice of the allegation, a hearing, the right to be accompanied, and a written decision. In the United Kingdom, for example, workers have a legal right to be accompanied at disciplinary and grievance hearings. Make sure this section matches your employment contracts and Disciplinary and Grievance Procedure. Budget for an external investigator: ask a local employment lawyer, HR consultancy or a peer organisation for names before you need one.</w:t>
             </w:r>
           </w:p>
         </w:tc>
@@ -6434,7 +6434,7 @@
           <w:sz w:val="20"/>
           <w:szCs w:val="20"/>
         </w:rPr>
-        <w:t xml:space="preserve">dismissal, or ending a volunteer role, board membership, contract or partnership, following our disciplinary procedure and the law;</w:t>
+        <w:t xml:space="preserve">dismissal, or ending a volunteer role, board membership, contract or partnership, following our Disciplinary and Grievance Procedure and the law;</w:t>
       </w:r>
     </w:p>
     <w:p>
@@ -7759,6 +7759,25 @@
           <w:highlight w:val="yellow"/>
         </w:rPr>
         <w:t xml:space="preserve">[Your disciplinary and grievance procedure]</w:t>
+      </w:r>
+    </w:p>
+    <w:p>
+      <w:pPr>
+        <w:pStyle w:val="ListParagraph"/>
+        <w:numPr>
+          <w:ilvl w:val="0"/>
+          <w:numId w:val="3"/>
+        </w:numPr>
+        <w:spacing w:after="80" w:line="290"/>
+      </w:pPr>
+      <w:r>
+        <w:rPr>
+          <w:rFonts w:ascii="Nunito Sans" w:cs="Nunito Sans" w:eastAsia="Nunito Sans" w:hAnsi="Nunito Sans"/>
+          <w:color w:val="102E3B"/>
+          <w:sz w:val="20"/>
+          <w:szCs w:val="20"/>
+        </w:rPr>
+        <w:t xml:space="preserve">Disciplinary and Grievance Procedure</w:t>
       </w:r>
     </w:p>
     <w:p>

</xml_diff>

<commit_message>
Legal library: 6 new templates (57 in all), Excel versions, fixed covers, edition stamp
- New: Governing Document Guide and Model Constitution; Board Meeting Agenda and Minutes; Board Member Role Description;
  Board Skills Matrix; Health, Safety and Lone Working Policy; Business Continuity and Crisis Plan
- Excel versions of Risk Register, Delegation of Authority Matrix, Records Retention Schedule, Board Skills Matrix
- Cover title no longer overlaps the organisation name; footer shows the template edition (2026-10)
- Prices page counts and savings follow the catalogue; Essentials contents recorded in pricing-config.js

Co-Authored-By: Claude Opus 5.5 <noreply@anthropic.com>
Claude-Session: https://claude.ai/code/session_012WEC1qutQtsV9VUQGDVAHW
</commit_message>
<xml_diff>
--- a/assets/legal-templates/anti-harassment-intimidation-and-bullying-policy-and-procedure.docx
+++ b/assets/legal-templates/anti-harassment-intimidation-and-bullying-policy-and-procedure.docx
@@ -74,7 +74,7 @@
     </w:p>
     <w:p>
       <w:pPr>
-        <w:spacing w:after="300"/>
+        <w:spacing w:after="360" w:line="360" w:lineRule="atLeast"/>
       </w:pPr>
       <w:r>
         <w:rPr>
@@ -91,7 +91,7 @@
     </w:p>
     <w:p>
       <w:pPr>
-        <w:spacing w:after="280" w:before="240" w:line="260"/>
+        <w:spacing w:after="280" w:before="120" w:line="920" w:lineRule="atLeast"/>
       </w:pPr>
       <w:r>
         <w:rPr>
@@ -9598,7 +9598,7 @@
         <w:sz w:val="14"/>
         <w:szCs w:val="14"/>
       </w:rPr>
-      <w:t xml:space="preserve">  |  Anti-Harassment, Intimidation and Bullying Policy and Procedure  |  Version [1.0]  |  From a Method into Impact template</w:t>
+      <w:t xml:space="preserve">  |  Anti-Harassment, Intimidation and Bullying Policy and Procedure  |  Version [1.0]  |  Method into Impact template, edition 2026-10</w:t>
     </w:r>
     <w:r>
       <w:rPr>

</xml_diff>